<commit_message>
Remove blank SOP title page
</commit_message>
<xml_diff>
--- a/document.docx
+++ b/document.docx
@@ -35,11 +35,6 @@
           <w:i/>
         </w:rPr>
         <w:t>Version 1.0 | Updated: 19 July 2026</w:t>
-      </w:r>
-    </w:p>
-    <w:p>
-      <w:r>
-        <w:br w:type="page"/>
       </w:r>
     </w:p>
     <w:p>

</xml_diff>